<commit_message>
minor cleanup to the readme
</commit_message>
<xml_diff>
--- a/submission ex2/readme.docx
+++ b/submission ex2/readme.docx
@@ -137,12 +137,6 @@
         <w:gridCol w:w="2769"/>
       </w:tblGrid>
       <w:tr>
-        <w:tblPrEx>
-          <w:tblCellMar>
-            <w:top w:w="0" w:type="dxa"/>
-            <w:bottom w:w="0" w:type="dxa"/>
-          </w:tblCellMar>
-        </w:tblPrEx>
         <w:tc>
           <w:tcPr>
             <w:tcW w:w="3800" w:type="dxa"/>
@@ -220,12 +214,6 @@
         </w:tc>
       </w:tr>
       <w:tr>
-        <w:tblPrEx>
-          <w:tblCellMar>
-            <w:top w:w="0" w:type="dxa"/>
-            <w:bottom w:w="0" w:type="dxa"/>
-          </w:tblCellMar>
-        </w:tblPrEx>
         <w:tc>
           <w:tcPr>
             <w:tcW w:w="3800" w:type="dxa"/>
@@ -288,12 +276,6 @@
         </w:tc>
       </w:tr>
       <w:tr>
-        <w:tblPrEx>
-          <w:tblCellMar>
-            <w:top w:w="0" w:type="dxa"/>
-            <w:bottom w:w="0" w:type="dxa"/>
-          </w:tblCellMar>
-        </w:tblPrEx>
         <w:tc>
           <w:tcPr>
             <w:tcW w:w="3800" w:type="dxa"/>
@@ -356,12 +338,6 @@
         </w:tc>
       </w:tr>
       <w:tr>
-        <w:tblPrEx>
-          <w:tblCellMar>
-            <w:top w:w="0" w:type="dxa"/>
-            <w:bottom w:w="0" w:type="dxa"/>
-          </w:tblCellMar>
-        </w:tblPrEx>
         <w:tc>
           <w:tcPr>
             <w:tcW w:w="3800" w:type="dxa"/>
@@ -424,12 +400,6 @@
         </w:tc>
       </w:tr>
       <w:tr>
-        <w:tblPrEx>
-          <w:tblCellMar>
-            <w:top w:w="0" w:type="dxa"/>
-            <w:bottom w:w="0" w:type="dxa"/>
-          </w:tblCellMar>
-        </w:tblPrEx>
         <w:tc>
           <w:tcPr>
             <w:tcW w:w="3800" w:type="dxa"/>
@@ -526,12 +496,6 @@
         <w:gridCol w:w="4153"/>
       </w:tblGrid>
       <w:tr>
-        <w:tblPrEx>
-          <w:tblCellMar>
-            <w:top w:w="0" w:type="dxa"/>
-            <w:bottom w:w="0" w:type="dxa"/>
-          </w:tblCellMar>
-        </w:tblPrEx>
         <w:tc>
           <w:tcPr>
             <w:tcW w:w="2600" w:type="dxa"/>
@@ -582,12 +546,6 @@
         </w:tc>
       </w:tr>
       <w:tr>
-        <w:tblPrEx>
-          <w:tblCellMar>
-            <w:top w:w="0" w:type="dxa"/>
-            <w:bottom w:w="0" w:type="dxa"/>
-          </w:tblCellMar>
-        </w:tblPrEx>
         <w:tc>
           <w:tcPr>
             <w:tcW w:w="2600" w:type="dxa"/>
@@ -638,12 +596,6 @@
         </w:tc>
       </w:tr>
       <w:tr>
-        <w:tblPrEx>
-          <w:tblCellMar>
-            <w:top w:w="0" w:type="dxa"/>
-            <w:bottom w:w="0" w:type="dxa"/>
-          </w:tblCellMar>
-        </w:tblPrEx>
         <w:tc>
           <w:tcPr>
             <w:tcW w:w="2600" w:type="dxa"/>
@@ -816,6 +768,7 @@
         <w:rPr>
           <w:rFonts w:cs="Calibri"/>
         </w:rPr>
+        <w:lastRenderedPageBreak/>
         <w:t>The batch file launches the application with everything it needs already bundled - the JavaFX SDK, JAXB, and the application's own jars - so nothing needs to be separately installed on the reviewer's machine.</w:t>
       </w:r>
     </w:p>
@@ -837,7 +790,19 @@
         <w:rPr>
           <w:rFonts w:cs="Calibri"/>
         </w:rPr>
-        <w:t xml:space="preserve">During development we hit a recurring crash inside JavaFX's own rendering pipeline: a </w:t>
+        <w:t xml:space="preserve">During development </w:t>
+      </w:r>
+      <w:r>
+        <w:rPr>
+          <w:rFonts w:cs="Calibri"/>
+        </w:rPr>
+        <w:t>I</w:t>
+      </w:r>
+      <w:r>
+        <w:rPr>
+          <w:rFonts w:cs="Calibri"/>
+        </w:rPr>
+        <w:t xml:space="preserve"> hit a recurring crash inside JavaFX's own rendering pipeline: a </w:t>
       </w:r>
       <w:r>
         <w:rPr>
@@ -934,7 +899,19 @@
         <w:rPr>
           <w:rFonts w:cs="Calibri"/>
         </w:rPr>
-        <w:t xml:space="preserve"> switches JavaFX to its Software (SW) rendering pipeline instead of Direct3D, which avoids the faulty code path entirely. We verified there is no visible difference in the UI and no noticeable slowdown, since this application is form- and table-driven rather than graphics-intensive. The flag is already built into </w:t>
+        <w:t xml:space="preserve"> switches JavaFX to its Software (SW) rendering pipeline instead of Direct3D, which avoids the faulty code path entirely. </w:t>
+      </w:r>
+      <w:r>
+        <w:rPr>
+          <w:rFonts w:cs="Calibri"/>
+        </w:rPr>
+        <w:t>I</w:t>
+      </w:r>
+      <w:r>
+        <w:rPr>
+          <w:rFonts w:cs="Calibri"/>
+        </w:rPr>
+        <w:t xml:space="preserve"> verified there is no visible difference in the UI and no noticeable slowdown, since this application is form- and table-driven rather than graphics-intensive. The flag is already built into </w:t>
       </w:r>
       <w:r>
         <w:rPr>
@@ -1184,6 +1161,7 @@
         <w:pStyle w:val="2"/>
       </w:pPr>
       <w:r>
+        <w:lastRenderedPageBreak/>
         <w:t>Filters as dropdowns rather than toggle buttons</w:t>
       </w:r>
     </w:p>
@@ -1218,7 +1196,19 @@
         <w:rPr>
           <w:rFonts w:cs="Calibri"/>
         </w:rPr>
-        <w:t>A user becomes blocked exactly when their balance goes negative, and is automatically un-blocked the moment a credit - a payout, a sale, a subsidy refund, and so on - brings their balance back to zero or above. We read being blocked as a live consequence of a negative balance rather than a one-way status: the alternative, a user locked out forever after a single trade even once the market later pays them enough to cover it, did not seem to be the intended behaviour.</w:t>
+        <w:t xml:space="preserve">A user becomes blocked exactly when their balance goes negative, and is automatically un-blocked the moment a credit - a payout, a sale, a subsidy refund, and so on - brings their balance back to zero or above. </w:t>
+      </w:r>
+      <w:r>
+        <w:rPr>
+          <w:rFonts w:cs="Calibri"/>
+        </w:rPr>
+        <w:t>I</w:t>
+      </w:r>
+      <w:r>
+        <w:rPr>
+          <w:rFonts w:cs="Calibri"/>
+        </w:rPr>
+        <w:t xml:space="preserve"> read being blocked as a live consequence of a negative balance rather than a one-way status: the alternative, a user locked out forever after a single trade even once the market later pays them enough to cover it, did not seem to be the intended behaviour.</w:t>
       </w:r>
     </w:p>
     <w:p>
@@ -1323,7 +1313,14 @@
         <w:rPr>
           <w:rFonts w:cs="Calibri"/>
         </w:rPr>
-        <w:t>An event created through the Create Event bonus behaves exactly like one loaded from the file - it starts inactive and must be opened by its creator before trading can happen - but since this exercise has no save and load, it exists only for the current session and is lost if a new file is loaded.</w:t>
+        <w:t xml:space="preserve">An event created through the Create Event bonus behaves exactly like one loaded from the file - it starts inactive and must be opened by its creator before trading can happen - but </w:t>
+      </w:r>
+      <w:r>
+        <w:rPr>
+          <w:rFonts w:cs="Calibri"/>
+        </w:rPr>
+        <w:lastRenderedPageBreak/>
+        <w:t>since this exercise has no save and load, it exists only for the current session and is lost if a new file is loaded.</w:t>
       </w:r>
     </w:p>
     <w:p>
@@ -1960,6 +1957,7 @@
           <w:color w:val="7C3AED"/>
           <w:sz w:val="20"/>
         </w:rPr>
+        <w:lastRenderedPageBreak/>
         <w:t>Main</w:t>
       </w:r>
       <w:r>
@@ -2001,6 +1999,7 @@
         <w:pStyle w:val="1"/>
       </w:pPr>
       <w:r>
+        <w:lastRenderedPageBreak/>
         <w:t>Bonuses - Details and How to Activate</w:t>
       </w:r>
     </w:p>

</xml_diff>